<commit_message>
Clarify domain registration and renewal paid by Contratante
Co-authored-by: Messias Neto <messiasneto74@users.noreply.github.com>
</commit_message>
<xml_diff>
--- a/contratos/contrato-prestacao-servicos-bacani-coura.docx
+++ b/contratos/contrato-prestacao-servicos-bacani-coura.docx
@@ -307,16 +307,51 @@
         <w:pStyle w:val="ListNumber"/>
       </w:pPr>
       <w:r>
-        <w:t xml:space="preserve">3.4. Despesas com </w:t>
+        <w:t xml:space="preserve">3.4. O </w:t>
       </w:r>
       <w:r>
         <w:rPr>
           <w:b/>
         </w:rPr>
-        <w:t>domínio, hospedagem, ferramentas de terceiros e demais custos de operação</w:t>
-      </w:r>
-      <w:r>
-        <w:t xml:space="preserve"> do site após a publicação, quando não cobertos expressamente pela implantação, são de responsabilidade da CONTRATANTE, podendo o PRESTADOR auxiliar na contratação ou configuração mediante acordo posterior.</w:t>
+        <w:t>registro, a renovação anual e todas as taxas do domínio</w:t>
+      </w:r>
+      <w:r>
+        <w:t xml:space="preserve"> do site (incluindo aquisição do nome e manutenção junto ao registrador) são de </w:t>
+      </w:r>
+      <w:r>
+        <w:rPr>
+          <w:b/>
+        </w:rPr>
+        <w:t>responsabilidade exclusiva da CONTRATANTE</w:t>
+      </w:r>
+      <w:r>
+        <w:t xml:space="preserve">, que deverá contratá-lo e mantê-lo </w:t>
+      </w:r>
+      <w:r>
+        <w:rPr>
+          <w:b/>
+        </w:rPr>
+        <w:t>em seu nome</w:t>
+      </w:r>
+      <w:r>
+        <w:t xml:space="preserve"> (ou em nome da LBMC). O PRESTADOR limita-se à orientação e à configuração de DNS na implantação, quando aplicável.</w:t>
+      </w:r>
+    </w:p>
+    <w:p>
+      <w:pPr>
+        <w:pStyle w:val="ListNumber"/>
+      </w:pPr>
+      <w:r>
+        <w:t xml:space="preserve">3.5. Despesas com </w:t>
+      </w:r>
+      <w:r>
+        <w:rPr>
+          <w:b/>
+        </w:rPr>
+        <w:t>hospedagem, ferramentas de terceiros e demais custos de operação</w:t>
+      </w:r>
+      <w:r>
+        <w:t xml:space="preserve"> do site após a publicação, quando não cobertos expressamente pela implantação, também são de responsabilidade da CONTRATANTE, podendo o PRESTADOR auxiliar na contratação ou configuração mediante acordo posterior (Cláusula 6).</w:t>
       </w:r>
     </w:p>
     <w:p>

</xml_diff>